<commit_message>
Continue to write trial review
</commit_message>
<xml_diff>
--- a/tests/trials.docx
+++ b/tests/trials.docx
@@ -243,8 +243,13 @@
         <w:t>“</w:t>
       </w:r>
       <w:r>
-        <w:t>&lt;br</w:t>
-      </w:r>
+        <w:t>&lt;</w:t>
+      </w:r>
+      <w:proofErr w:type="spellStart"/>
+      <w:r>
+        <w:t>br</w:t>
+      </w:r>
+      <w:proofErr w:type="spellEnd"/>
       <w:r>
         <w:t xml:space="preserve"> /</w:t>
       </w:r>
@@ -276,7 +281,7 @@
           <w:noProof/>
         </w:rPr>
         <w:drawing>
-          <wp:anchor distT="0" distB="0" distL="114300" distR="114300" simplePos="0" relativeHeight="251658240" behindDoc="0" locked="0" layoutInCell="1" allowOverlap="1" wp14:anchorId="3DB256D8" wp14:editId="2E5FED1D">
+          <wp:anchor distT="0" distB="0" distL="114300" distR="114300" simplePos="0" relativeHeight="251658240" behindDoc="0" locked="0" layoutInCell="1" allowOverlap="1" wp14:anchorId="3DB256D8" wp14:editId="017F582E">
             <wp:simplePos x="0" y="0"/>
             <wp:positionH relativeFrom="margin">
               <wp:align>left</wp:align>
@@ -850,21 +855,7 @@
           <w:sz w:val="48"/>
           <w:szCs w:val="48"/>
         </w:rPr>
-        <w:t>Round</w:t>
-      </w:r>
-      <w:r>
-        <w:rPr>
-          <w:sz w:val="48"/>
-          <w:szCs w:val="48"/>
-        </w:rPr>
-        <w:t xml:space="preserve"> 2</w:t>
-      </w:r>
-      <w:r>
-        <w:rPr>
-          <w:sz w:val="48"/>
-          <w:szCs w:val="48"/>
-        </w:rPr>
-        <w:t>:</w:t>
+        <w:t>Round 2:</w:t>
       </w:r>
     </w:p>
     <w:p>
@@ -875,12 +866,9 @@
         </w:rPr>
       </w:pPr>
       <w:r>
-        <w:t>Link to google forms survey:</w:t>
-      </w:r>
-      <w:r>
-        <w:t xml:space="preserve"> </w:t>
-      </w:r>
-      <w:hyperlink r:id="rId12" w:history="1">
+        <w:t xml:space="preserve">Link to google forms survey: </w:t>
+      </w:r>
+      <w:hyperlink r:id="rId12" w:anchor="responses" w:history="1">
         <w:r>
           <w:rPr>
             <w:rStyle w:val="Hyperlink"/>
@@ -900,19 +888,7 @@
     </w:p>
     <w:p>
       <w:r>
-        <w:t xml:space="preserve">In the </w:t>
-      </w:r>
-      <w:r>
-        <w:t>second</w:t>
-      </w:r>
-      <w:r>
-        <w:t xml:space="preserve"> round of trialling, I asked</w:t>
-      </w:r>
-      <w:r>
-        <w:t xml:space="preserve"> a different</w:t>
-      </w:r>
-      <w:r>
-        <w:t xml:space="preserve"> 4 male and female English-speaking students (aged 16-20) across New Zealand their preferences on </w:t>
+        <w:t xml:space="preserve">In the second round of trialling, I asked a different 4 male and female English-speaking students (aged 16-20) across New Zealand their preferences on </w:t>
       </w:r>
       <w:r>
         <w:t xml:space="preserve">heading and text sizes and image complexities along with </w:t>
@@ -960,7 +936,22 @@
         <w:t>feedback,</w:t>
       </w:r>
       <w:r>
-        <w:t xml:space="preserve"> I will increase the heading size from [[[[]]]]]</w:t>
+        <w:t xml:space="preserve"> I will increase the heading size from </w:t>
+      </w:r>
+      <w:r>
+        <w:t>2rem (36px)</w:t>
+      </w:r>
+      <w:r>
+        <w:t xml:space="preserve"> to 2.5rem</w:t>
+      </w:r>
+      <w:r>
+        <w:t xml:space="preserve"> </w:t>
+      </w:r>
+      <w:r>
+        <w:t>(</w:t>
+      </w:r>
+      <w:r>
+        <w:t>45px)</w:t>
       </w:r>
       <w:r>
         <w:t xml:space="preserve"> which should make the </w:t>
@@ -974,7 +965,142 @@
       <w:r>
         <w:t xml:space="preserve"> to read thereby improving the websites accessibility and fitness for purpose.</w:t>
       </w:r>
-    </w:p>
+      <w:r>
+        <w:t xml:space="preserve"> This is also smaller than the 3rem (54px) </w:t>
+      </w:r>
+      <w:r>
+        <w:t>shown in the question so that it can satisfy more of the users</w:t>
+      </w:r>
+      <w:r>
+        <w:t xml:space="preserve"> while still improving the website’s accessibility.</w:t>
+      </w:r>
+    </w:p>
+    <w:p>
+      <w:r>
+        <w:t>Before:                                                                                               After:</w:t>
+      </w:r>
+    </w:p>
+    <w:p>
+      <w:r>
+        <w:drawing>
+          <wp:anchor distT="0" distB="0" distL="114300" distR="114300" simplePos="0" relativeHeight="251660293" behindDoc="0" locked="0" layoutInCell="1" allowOverlap="1" wp14:anchorId="5BDE7EDE" wp14:editId="210F4132">
+            <wp:simplePos x="0" y="0"/>
+            <wp:positionH relativeFrom="margin">
+              <wp:posOffset>3406775</wp:posOffset>
+            </wp:positionH>
+            <wp:positionV relativeFrom="paragraph">
+              <wp:posOffset>182245</wp:posOffset>
+            </wp:positionV>
+            <wp:extent cx="3230880" cy="1817224"/>
+            <wp:effectExtent l="0" t="0" r="7620" b="0"/>
+            <wp:wrapNone/>
+            <wp:docPr id="1884108718" name="Picture 1"/>
+            <wp:cNvGraphicFramePr>
+              <a:graphicFrameLocks xmlns:a="http://schemas.openxmlformats.org/drawingml/2006/main" noChangeAspect="1"/>
+            </wp:cNvGraphicFramePr>
+            <a:graphic xmlns:a="http://schemas.openxmlformats.org/drawingml/2006/main">
+              <a:graphicData uri="http://schemas.openxmlformats.org/drawingml/2006/picture">
+                <pic:pic xmlns:pic="http://schemas.openxmlformats.org/drawingml/2006/picture">
+                  <pic:nvPicPr>
+                    <pic:cNvPr id="1884108718" name=""/>
+                    <pic:cNvPicPr/>
+                  </pic:nvPicPr>
+                  <pic:blipFill>
+                    <a:blip r:embed="rId13" cstate="print">
+                      <a:extLst>
+                        <a:ext uri="{28A0092B-C50C-407E-A947-70E740481C1C}">
+                          <a14:useLocalDpi xmlns:a14="http://schemas.microsoft.com/office/drawing/2010/main" val="0"/>
+                        </a:ext>
+                      </a:extLst>
+                    </a:blip>
+                    <a:stretch>
+                      <a:fillRect/>
+                    </a:stretch>
+                  </pic:blipFill>
+                  <pic:spPr>
+                    <a:xfrm>
+                      <a:off x="0" y="0"/>
+                      <a:ext cx="3230880" cy="1817224"/>
+                    </a:xfrm>
+                    <a:prstGeom prst="rect">
+                      <a:avLst/>
+                    </a:prstGeom>
+                  </pic:spPr>
+                </pic:pic>
+              </a:graphicData>
+            </a:graphic>
+            <wp14:sizeRelH relativeFrom="margin">
+              <wp14:pctWidth>0</wp14:pctWidth>
+            </wp14:sizeRelH>
+            <wp14:sizeRelV relativeFrom="margin">
+              <wp14:pctHeight>0</wp14:pctHeight>
+            </wp14:sizeRelV>
+          </wp:anchor>
+        </w:drawing>
+      </w:r>
+      <w:r>
+        <w:drawing>
+          <wp:anchor distT="0" distB="0" distL="114300" distR="114300" simplePos="0" relativeHeight="251659269" behindDoc="0" locked="0" layoutInCell="1" allowOverlap="1" wp14:anchorId="49A6E657" wp14:editId="26E65580">
+            <wp:simplePos x="0" y="0"/>
+            <wp:positionH relativeFrom="margin">
+              <wp:align>left</wp:align>
+            </wp:positionH>
+            <wp:positionV relativeFrom="paragraph">
+              <wp:posOffset>190500</wp:posOffset>
+            </wp:positionV>
+            <wp:extent cx="3209692" cy="1805305"/>
+            <wp:effectExtent l="0" t="0" r="0" b="4445"/>
+            <wp:wrapNone/>
+            <wp:docPr id="447749212" name="Picture 1"/>
+            <wp:cNvGraphicFramePr>
+              <a:graphicFrameLocks xmlns:a="http://schemas.openxmlformats.org/drawingml/2006/main" noChangeAspect="1"/>
+            </wp:cNvGraphicFramePr>
+            <a:graphic xmlns:a="http://schemas.openxmlformats.org/drawingml/2006/main">
+              <a:graphicData uri="http://schemas.openxmlformats.org/drawingml/2006/picture">
+                <pic:pic xmlns:pic="http://schemas.openxmlformats.org/drawingml/2006/picture">
+                  <pic:nvPicPr>
+                    <pic:cNvPr id="447749212" name=""/>
+                    <pic:cNvPicPr/>
+                  </pic:nvPicPr>
+                  <pic:blipFill>
+                    <a:blip r:embed="rId14" cstate="print">
+                      <a:extLst>
+                        <a:ext uri="{28A0092B-C50C-407E-A947-70E740481C1C}">
+                          <a14:useLocalDpi xmlns:a14="http://schemas.microsoft.com/office/drawing/2010/main" val="0"/>
+                        </a:ext>
+                      </a:extLst>
+                    </a:blip>
+                    <a:stretch>
+                      <a:fillRect/>
+                    </a:stretch>
+                  </pic:blipFill>
+                  <pic:spPr>
+                    <a:xfrm>
+                      <a:off x="0" y="0"/>
+                      <a:ext cx="3209692" cy="1805305"/>
+                    </a:xfrm>
+                    <a:prstGeom prst="rect">
+                      <a:avLst/>
+                    </a:prstGeom>
+                  </pic:spPr>
+                </pic:pic>
+              </a:graphicData>
+            </a:graphic>
+            <wp14:sizeRelH relativeFrom="margin">
+              <wp14:pctWidth>0</wp14:pctWidth>
+            </wp14:sizeRelH>
+            <wp14:sizeRelV relativeFrom="margin">
+              <wp14:pctHeight>0</wp14:pctHeight>
+            </wp14:sizeRelV>
+          </wp:anchor>
+        </w:drawing>
+      </w:r>
+    </w:p>
+    <w:p/>
+    <w:p/>
+    <w:p/>
+    <w:p/>
+    <w:p/>
     <w:p>
       <w:pPr>
         <w:rPr>
@@ -987,6 +1113,7 @@
           <w:sz w:val="36"/>
           <w:szCs w:val="36"/>
         </w:rPr>
+        <w:lastRenderedPageBreak/>
         <w:t>Font sizes</w:t>
       </w:r>
     </w:p>
@@ -1001,7 +1128,16 @@
         <w:t>Therefore,</w:t>
       </w:r>
       <w:r>
-        <w:t xml:space="preserve"> I decided to increase the font size slightly</w:t>
+        <w:t xml:space="preserve"> I decided to increase the font size</w:t>
+      </w:r>
+      <w:r>
+        <w:t xml:space="preserve"> of main text</w:t>
+      </w:r>
+      <w:r>
+        <w:t xml:space="preserve"> slightly</w:t>
+      </w:r>
+      <w:r>
+        <w:t xml:space="preserve"> (from 18px to 20px)</w:t>
       </w:r>
       <w:r>
         <w:t xml:space="preserve"> to make the website more </w:t>
@@ -1015,10 +1151,133 @@
       <w:r>
         <w:t xml:space="preserve"> to read the content.</w:t>
       </w:r>
-      <w:r>
-        <w:t xml:space="preserve"> []][][][][][</w:t>
-      </w:r>
-    </w:p>
+    </w:p>
+    <w:p>
+      <w:r>
+        <w:drawing>
+          <wp:anchor distT="0" distB="0" distL="114300" distR="114300" simplePos="0" relativeHeight="251662341" behindDoc="0" locked="0" layoutInCell="1" allowOverlap="1" wp14:anchorId="6B16CBCF" wp14:editId="46A54383">
+            <wp:simplePos x="0" y="0"/>
+            <wp:positionH relativeFrom="margin">
+              <wp:posOffset>3482340</wp:posOffset>
+            </wp:positionH>
+            <wp:positionV relativeFrom="paragraph">
+              <wp:posOffset>269240</wp:posOffset>
+            </wp:positionV>
+            <wp:extent cx="3341540" cy="1879464"/>
+            <wp:effectExtent l="0" t="0" r="0" b="6985"/>
+            <wp:wrapNone/>
+            <wp:docPr id="926461226" name="Picture 1"/>
+            <wp:cNvGraphicFramePr>
+              <a:graphicFrameLocks xmlns:a="http://schemas.openxmlformats.org/drawingml/2006/main" noChangeAspect="1"/>
+            </wp:cNvGraphicFramePr>
+            <a:graphic xmlns:a="http://schemas.openxmlformats.org/drawingml/2006/main">
+              <a:graphicData uri="http://schemas.openxmlformats.org/drawingml/2006/picture">
+                <pic:pic xmlns:pic="http://schemas.openxmlformats.org/drawingml/2006/picture">
+                  <pic:nvPicPr>
+                    <pic:cNvPr id="926461226" name=""/>
+                    <pic:cNvPicPr/>
+                  </pic:nvPicPr>
+                  <pic:blipFill>
+                    <a:blip r:embed="rId15" cstate="print">
+                      <a:extLst>
+                        <a:ext uri="{28A0092B-C50C-407E-A947-70E740481C1C}">
+                          <a14:useLocalDpi xmlns:a14="http://schemas.microsoft.com/office/drawing/2010/main" val="0"/>
+                        </a:ext>
+                      </a:extLst>
+                    </a:blip>
+                    <a:stretch>
+                      <a:fillRect/>
+                    </a:stretch>
+                  </pic:blipFill>
+                  <pic:spPr>
+                    <a:xfrm>
+                      <a:off x="0" y="0"/>
+                      <a:ext cx="3341540" cy="1879464"/>
+                    </a:xfrm>
+                    <a:prstGeom prst="rect">
+                      <a:avLst/>
+                    </a:prstGeom>
+                  </pic:spPr>
+                </pic:pic>
+              </a:graphicData>
+            </a:graphic>
+            <wp14:sizeRelH relativeFrom="margin">
+              <wp14:pctWidth>0</wp14:pctWidth>
+            </wp14:sizeRelH>
+            <wp14:sizeRelV relativeFrom="margin">
+              <wp14:pctHeight>0</wp14:pctHeight>
+            </wp14:sizeRelV>
+          </wp:anchor>
+        </w:drawing>
+      </w:r>
+      <w:r>
+        <w:drawing>
+          <wp:anchor distT="0" distB="0" distL="114300" distR="114300" simplePos="0" relativeHeight="251661317" behindDoc="0" locked="0" layoutInCell="1" allowOverlap="1" wp14:anchorId="207FEDB6" wp14:editId="1FCADD9E">
+            <wp:simplePos x="0" y="0"/>
+            <wp:positionH relativeFrom="margin">
+              <wp:posOffset>-175260</wp:posOffset>
+            </wp:positionH>
+            <wp:positionV relativeFrom="paragraph">
+              <wp:posOffset>269240</wp:posOffset>
+            </wp:positionV>
+            <wp:extent cx="3373393" cy="1897380"/>
+            <wp:effectExtent l="0" t="0" r="0" b="7620"/>
+            <wp:wrapNone/>
+            <wp:docPr id="741959261" name="Picture 1"/>
+            <wp:cNvGraphicFramePr>
+              <a:graphicFrameLocks xmlns:a="http://schemas.openxmlformats.org/drawingml/2006/main" noChangeAspect="1"/>
+            </wp:cNvGraphicFramePr>
+            <a:graphic xmlns:a="http://schemas.openxmlformats.org/drawingml/2006/main">
+              <a:graphicData uri="http://schemas.openxmlformats.org/drawingml/2006/picture">
+                <pic:pic xmlns:pic="http://schemas.openxmlformats.org/drawingml/2006/picture">
+                  <pic:nvPicPr>
+                    <pic:cNvPr id="741959261" name=""/>
+                    <pic:cNvPicPr/>
+                  </pic:nvPicPr>
+                  <pic:blipFill>
+                    <a:blip r:embed="rId16" cstate="print">
+                      <a:extLst>
+                        <a:ext uri="{28A0092B-C50C-407E-A947-70E740481C1C}">
+                          <a14:useLocalDpi xmlns:a14="http://schemas.microsoft.com/office/drawing/2010/main" val="0"/>
+                        </a:ext>
+                      </a:extLst>
+                    </a:blip>
+                    <a:stretch>
+                      <a:fillRect/>
+                    </a:stretch>
+                  </pic:blipFill>
+                  <pic:spPr>
+                    <a:xfrm>
+                      <a:off x="0" y="0"/>
+                      <a:ext cx="3373393" cy="1897380"/>
+                    </a:xfrm>
+                    <a:prstGeom prst="rect">
+                      <a:avLst/>
+                    </a:prstGeom>
+                  </pic:spPr>
+                </pic:pic>
+              </a:graphicData>
+            </a:graphic>
+            <wp14:sizeRelH relativeFrom="margin">
+              <wp14:pctWidth>0</wp14:pctWidth>
+            </wp14:sizeRelH>
+            <wp14:sizeRelV relativeFrom="margin">
+              <wp14:pctHeight>0</wp14:pctHeight>
+            </wp14:sizeRelV>
+          </wp:anchor>
+        </w:drawing>
+      </w:r>
+      <w:r>
+        <w:t>Before:                                                                                                 After:</w:t>
+      </w:r>
+    </w:p>
+    <w:p/>
+    <w:p/>
+    <w:p/>
+    <w:p/>
+    <w:p/>
+    <w:p/>
+    <w:p/>
     <w:p>
       <w:pPr>
         <w:rPr>
@@ -1031,70 +1290,139 @@
           <w:sz w:val="36"/>
           <w:szCs w:val="36"/>
         </w:rPr>
-        <w:t>Image complexity</w:t>
-      </w:r>
-    </w:p>
-    <w:p>
-      <w:r>
-        <w:t>This</w:t>
-      </w:r>
-      <w:r>
-        <w:t xml:space="preserve"> question asked users if they preferred simple images</w:t>
-      </w:r>
-      <w:r>
-        <w:t xml:space="preserve"> or complex infographics for the learn sections</w:t>
-      </w:r>
-      <w:r>
-        <w:t xml:space="preserve">. Unanimously responders chose </w:t>
-      </w:r>
-      <w:r>
-        <w:t xml:space="preserve">simple images with the most common theme </w:t>
-      </w:r>
-      <w:r>
-        <w:lastRenderedPageBreak/>
-        <w:t>being the infographics were overwhelming and not helpful.</w:t>
-      </w:r>
-      <w:r>
-        <w:t xml:space="preserve"> </w:t>
-      </w:r>
-      <w:r>
-        <w:t>Because of this feedback I went through the learn section and changed every complex infographic</w:t>
-      </w:r>
-      <w:r>
-        <w:t>, this made the design feel more consistent as the images were much more similar</w:t>
-      </w:r>
-      <w:r>
-        <w:t xml:space="preserve"> and less overwhelming which improved the usability as minimalist aesthetic allowing users to learn</w:t>
-      </w:r>
-      <w:r>
-        <w:t xml:space="preserve"> with less distractions</w:t>
-      </w:r>
-      <w:r>
-        <w:t>. An example of an image changed is below.</w:t>
-      </w:r>
-      <w:r>
-        <w:t xml:space="preserve"> </w:t>
-      </w:r>
-    </w:p>
-    <w:p>
-      <w:pPr>
+        <w:t>Image complexit</w:t>
+      </w:r>
+      <w:r>
         <w:rPr>
           <w:sz w:val="36"/>
           <w:szCs w:val="36"/>
         </w:rPr>
-      </w:pPr>
-      <w:r>
+        <w:t>y</w:t>
+      </w:r>
+    </w:p>
+    <w:p>
+      <w:r>
+        <w:t>This question asked users if they preferred simple images</w:t>
+      </w:r>
+      <w:r>
+        <w:t xml:space="preserve"> or complex infographics for the learn sections</w:t>
+      </w:r>
+      <w:r>
+        <w:t xml:space="preserve">. Unanimously responders chose </w:t>
+      </w:r>
+      <w:r>
+        <w:t>simple images with the most common theme being the infographics were overwhelming and not helpful.</w:t>
+      </w:r>
+      <w:r>
+        <w:t xml:space="preserve"> </w:t>
+      </w:r>
+      <w:r>
+        <w:t>Because of this feedback I went through the learn section and changed every complex infographic</w:t>
+      </w:r>
+      <w:r>
+        <w:t>, this made the design feel more consistent as the images were much more similar</w:t>
+      </w:r>
+      <w:r>
+        <w:t xml:space="preserve"> and less overwhelming which improved the usability as minimalist aesthetic allowing users to learn</w:t>
+      </w:r>
+      <w:r>
+        <w:t xml:space="preserve"> with less distractions</w:t>
+      </w:r>
+      <w:r>
+        <w:t>. An example of an image changed is below.</w:t>
+      </w:r>
+      <w:r>
+        <w:t xml:space="preserve"> </w:t>
+      </w:r>
+    </w:p>
+    <w:p>
+      <w:r>
+        <w:t>Before:                                                                                                                    After:</w:t>
+      </w:r>
+    </w:p>
+    <w:p>
+      <w:r>
+        <w:drawing>
+          <wp:anchor distT="0" distB="0" distL="114300" distR="114300" simplePos="0" relativeHeight="251663365" behindDoc="0" locked="0" layoutInCell="1" allowOverlap="1" wp14:anchorId="43B2AF44" wp14:editId="3D8C33A0">
+            <wp:simplePos x="0" y="0"/>
+            <wp:positionH relativeFrom="column">
+              <wp:posOffset>122555</wp:posOffset>
+            </wp:positionH>
+            <wp:positionV relativeFrom="paragraph">
+              <wp:posOffset>23495</wp:posOffset>
+            </wp:positionV>
+            <wp:extent cx="3360420" cy="1889702"/>
+            <wp:effectExtent l="0" t="0" r="0" b="0"/>
+            <wp:wrapNone/>
+            <wp:docPr id="1396296875" name="Picture 1"/>
+            <wp:cNvGraphicFramePr>
+              <a:graphicFrameLocks xmlns:a="http://schemas.openxmlformats.org/drawingml/2006/main" noChangeAspect="1"/>
+            </wp:cNvGraphicFramePr>
+            <a:graphic xmlns:a="http://schemas.openxmlformats.org/drawingml/2006/main">
+              <a:graphicData uri="http://schemas.openxmlformats.org/drawingml/2006/picture">
+                <pic:pic xmlns:pic="http://schemas.openxmlformats.org/drawingml/2006/picture">
+                  <pic:nvPicPr>
+                    <pic:cNvPr id="1396296875" name=""/>
+                    <pic:cNvPicPr/>
+                  </pic:nvPicPr>
+                  <pic:blipFill>
+                    <a:blip r:embed="rId17" cstate="print">
+                      <a:extLst>
+                        <a:ext uri="{28A0092B-C50C-407E-A947-70E740481C1C}">
+                          <a14:useLocalDpi xmlns:a14="http://schemas.microsoft.com/office/drawing/2010/main" val="0"/>
+                        </a:ext>
+                      </a:extLst>
+                    </a:blip>
+                    <a:stretch>
+                      <a:fillRect/>
+                    </a:stretch>
+                  </pic:blipFill>
+                  <pic:spPr>
+                    <a:xfrm>
+                      <a:off x="0" y="0"/>
+                      <a:ext cx="3372904" cy="1896722"/>
+                    </a:xfrm>
+                    <a:prstGeom prst="rect">
+                      <a:avLst/>
+                    </a:prstGeom>
+                  </pic:spPr>
+                </pic:pic>
+              </a:graphicData>
+            </a:graphic>
+            <wp14:sizeRelH relativeFrom="margin">
+              <wp14:pctWidth>0</wp14:pctWidth>
+            </wp14:sizeRelH>
+            <wp14:sizeRelV relativeFrom="margin">
+              <wp14:pctHeight>0</wp14:pctHeight>
+            </wp14:sizeRelV>
+          </wp:anchor>
+        </w:drawing>
+      </w:r>
+    </w:p>
+    <w:p/>
+    <w:p/>
+    <w:p/>
+    <w:p/>
+    <w:p>
+      <w:pPr>
         <w:rPr>
           <w:sz w:val="36"/>
           <w:szCs w:val="36"/>
         </w:rPr>
-        <w:t>Open improvement questions</w:t>
-      </w:r>
+      </w:pPr>
       <w:r>
         <w:rPr>
           <w:sz w:val="36"/>
           <w:szCs w:val="36"/>
         </w:rPr>
+        <w:lastRenderedPageBreak/>
+        <w:t>Open improvement questions</w:t>
+      </w:r>
+      <w:r>
+        <w:rPr>
+          <w:sz w:val="36"/>
+          <w:szCs w:val="36"/>
+        </w:rPr>
         <w:t xml:space="preserve"> and reflection</w:t>
       </w:r>
     </w:p>
@@ -1109,13 +1437,21 @@
         <w:t xml:space="preserve">hought I [they] should” so I </w:t>
       </w:r>
       <w:r>
-        <w:t>disregarded the suggestion since I nor any other tr</w:t>
+        <w:t xml:space="preserve">disregarded the suggestion since I nor any other </w:t>
+      </w:r>
+      <w:proofErr w:type="spellStart"/>
+      <w:r>
+        <w:t>tr</w:t>
       </w:r>
       <w:r>
         <w:t>ial</w:t>
       </w:r>
       <w:r>
-        <w:t xml:space="preserve">lers felt </w:t>
+        <w:t>lers</w:t>
+      </w:r>
+      <w:proofErr w:type="spellEnd"/>
+      <w:r>
+        <w:t xml:space="preserve"> felt </w:t>
       </w:r>
       <w:r>
         <w:t>the same way</w:t>
@@ -1149,7 +1485,15 @@
         <w:t>‘</w:t>
       </w:r>
       <w:r>
-        <w:t>tests\trialling_images\round_2\play_screen_recording.mp4</w:t>
+        <w:t>tests\</w:t>
+      </w:r>
+      <w:proofErr w:type="spellStart"/>
+      <w:r>
+        <w:t>trialling_images</w:t>
+      </w:r>
+      <w:proofErr w:type="spellEnd"/>
+      <w:r>
+        <w:t>\round_2\play_screen_recording.mp4</w:t>
       </w:r>
       <w:r>
         <w:t>’) of the play experience and asked users if they had any improvements, none were given</w:t>

</xml_diff>